<commit_message>
Update Bible study notes content for multiple languages for 2026-05-07 release
</commit_message>
<xml_diff>
--- a/fra/docx/42.content.docx
+++ b/fra/docx/42.content.docx
@@ -38519,42 +38519,6 @@
           <w:lang w:val="fr_FR" w:bidi="fr_FR"/>
         </w:rPr>
         <w:t>).</w:t>
-      </w:r>
-      <w:r>
-        <w:rPr>
-          <w:lang w:val="fr_FR" w:bidi="fr_FR"/>
-        </w:rPr>
-      </w:r>
-      <w:r>
-        <w:rPr>
-          <w:lang w:val="fr_FR" w:bidi="fr_FR"/>
-        </w:rPr>
-      </w:r>
-    </w:p>
-    <w:p>
-      <w:pPr/>
-      <w:r>
-        <w:rPr>
-          <w:lang w:val="fr_FR" w:bidi="fr_FR"/>
-        </w:rPr>
-      </w:r>
-    </w:p>
-    <w:p>
-      <w:pPr>
-        <w:pStyle w:val="Heading2"/>
-      </w:pPr>
-      <w:r>
-        <w:rPr>
-          <w:lang w:val="fr_FR" w:bidi="fr_FR"/>
-        </w:rPr>
-      </w:r>
-    </w:p>
-    <w:p>
-      <w:pPr/>
-      <w:r>
-        <w:rPr>
-          <w:lang w:val="fr_FR" w:bidi="fr_FR"/>
-        </w:rPr>
       </w:r>
       <w:r>
         <w:rPr>

</xml_diff>